<commit_message>
Dopisovani 2 normostran o databzich
</commit_message>
<xml_diff>
--- a/Šablona MPO.docx
+++ b/Šablona MPO.docx
@@ -973,7 +973,7 @@
         <w:rPr>
           <w:noProof/>
         </w:rPr>
-        <w:t>10. prosince 2025</w:t>
+        <w:t>13. prosince 2025</w:t>
       </w:r>
       <w:r>
         <w:fldChar w:fldCharType="end"/>
@@ -1035,7 +1035,7 @@
         <w:rPr>
           <w:noProof/>
         </w:rPr>
-        <w:t>10. prosince 2025</w:t>
+        <w:t>13. prosince 2025</w:t>
       </w:r>
       <w:r>
         <w:fldChar w:fldCharType="end"/>
@@ -6091,7 +6091,13 @@
     <w:p>
       <w:r>
         <w:lastRenderedPageBreak/>
-        <w:t>Je dobré taky používat více faktorové ověřování (MFA), pokud je to možné. MFA při přihlašování k účtu vyžaduje více druhů ověření. Jako například je klasické jméno a heslo a pak následně vám ještě pošle jednorázový vygenerovaný kód.</w:t>
+        <w:t>Je dobré taky používat více faktorové ověřování (MFA), pokud je to možné. MFA při přihlašování k účtu vyžaduje více druhů ověření. Jako například je klasické jméno a</w:t>
+      </w:r>
+      <w:r>
+        <w:t> </w:t>
+      </w:r>
+      <w:r>
+        <w:t>heslo a pak následně vám ještě pošle jednorázový vygenerovaný kód.</w:t>
       </w:r>
       <w:r>
         <w:t xml:space="preserve"> [</w:t>
@@ -6158,16 +6164,16 @@
         </w:rPr>
         <w:t>[</w:t>
       </w:r>
+      <w:r>
+        <w:t xml:space="preserve"> </w:t>
+      </w:r>
+      <w:r>
+        <w:rPr>
+          <w:rFonts w:eastAsiaTheme="minorEastAsia"/>
+        </w:rPr>
+        <w:t>https://learn.microsoft.com/en-us/dotnet/architecture/modern-web-apps-azure/common-web-application-architectures</w:t>
+      </w:r>
       <w:proofErr w:type="gramEnd"/>
-      <w:r>
-        <w:t xml:space="preserve"> </w:t>
-      </w:r>
-      <w:r>
-        <w:rPr>
-          <w:rFonts w:eastAsiaTheme="minorEastAsia"/>
-        </w:rPr>
-        <w:t>https://learn.microsoft.com/en-us/dotnet/architecture/modern-web-apps-azure/common-web-application-architectures</w:t>
-      </w:r>
       <w:r>
         <w:rPr>
           <w:rFonts w:eastAsiaTheme="minorEastAsia"/>
@@ -6673,322 +6679,158 @@
     </w:p>
     <w:p>
       <w:pPr>
-        <w:rPr>
-          <w:color w:val="EE0000"/>
-          <w:lang w:eastAsia="sk-SK"/>
-        </w:rPr>
-      </w:pPr>
-      <w:r>
-        <w:rPr>
-          <w:color w:val="EE0000"/>
-        </w:rPr>
-        <w:t xml:space="preserve">Relační model byl poprvé popsán E. F. </w:t>
+        <w:pStyle w:val="Pokraovn"/>
+      </w:pPr>
+      <w:r>
+        <w:t>Relační databáze je databázový systém založený na vztazích mezi daty. Skládá se z</w:t>
+      </w:r>
+      <w:r>
+        <w:t> </w:t>
+      </w:r>
+      <w:r>
+        <w:t>jednotlivých tabulek, které jsou vzájemně propojeny. Každá tabulka uchovává strukturované informace pouze o jedné konkrétní oblasti. Základem tohoto typu databáze je relační model, který tvoří základ většiny současných komerčních databázových systémů.</w:t>
+      </w:r>
+    </w:p>
+    <w:p>
+      <w:pPr>
+        <w:pStyle w:val="Pokraovn"/>
+      </w:pPr>
+      <w:r>
+        <w:t xml:space="preserve"> [</w:t>
+      </w:r>
+      <w:r>
+        <w:t>https://wikisofia.cz/wiki/Rela%C4%8Dn%C3%AD_datab%C3%A1ze</w:t>
+      </w:r>
+      <w:r>
+        <w:t>]</w:t>
+      </w:r>
+    </w:p>
+    <w:p>
+      <w:pPr>
+        <w:pStyle w:val="Pokraovn"/>
+      </w:pPr>
+      <w:r>
+        <w:t>Tabulky, které jsou stavebním kamenem relačních databází, jsou propojeny předem definovanými vazbami. Strukturu tabulky tvoří sloupce neboli atributy a řádky představující záznamy. Atributy určují vlastnosti entit, které jsou do tabulky ukládány</w:t>
+      </w:r>
+      <w:r>
+        <w:t>,</w:t>
+      </w:r>
+      <w:r>
+        <w:t xml:space="preserve"> v jedné tabulce se nacházejí entity stejného typu, přičemž každá je zaznamenána pouze jedinkrát. Relace pak vyjadřuje vazbu mezi prvky jedné či více množin. Lze ji popsat jako dvourozměrnou strukturu složenou z řádků a sloupců.</w:t>
+      </w:r>
+    </w:p>
+    <w:p>
+      <w:r>
+        <w:t>[</w:t>
+      </w:r>
+      <w:r>
+        <w:t>https://wikisofia.cz/wiki/Rela%C4%8Dn%C3%AD_datab%C3%A1ze</w:t>
+      </w:r>
+      <w:r>
+        <w:t>]</w:t>
+      </w:r>
+    </w:p>
+    <w:p>
+      <w:pPr>
+        <w:pStyle w:val="Pokraovn"/>
+      </w:pPr>
+    </w:p>
+    <w:p>
+      <w:pPr>
+        <w:pStyle w:val="Nadpis3"/>
+        <w:rPr>
+          <w:color w:val="auto"/>
+        </w:rPr>
+      </w:pPr>
+      <w:bookmarkStart w:id="30" w:name="_Toc216301966"/>
+      <w:r>
+        <w:rPr>
+          <w:color w:val="auto"/>
+        </w:rPr>
+        <w:t>SQL příkazy</w:t>
+      </w:r>
+      <w:bookmarkEnd w:id="30"/>
+      <w:r>
+        <w:rPr>
+          <w:color w:val="auto"/>
+        </w:rPr>
+        <w:t xml:space="preserve"> </w:t>
+      </w:r>
+    </w:p>
+    <w:p>
+      <w:pPr>
+        <w:pStyle w:val="Pokraovn"/>
+      </w:pPr>
+      <w:r>
+        <w:t>Jazyk SQL využívá pro tvorbu příkazů a dotazů řadu klíčových slov.</w:t>
+      </w:r>
+    </w:p>
+    <w:p>
+      <w:pPr>
+        <w:pStyle w:val="Pokraovn"/>
+      </w:pPr>
+      <w:r>
+        <w:t>Příkaz (</w:t>
       </w:r>
       <w:proofErr w:type="spellStart"/>
       <w:r>
-        <w:rPr>
-          <w:color w:val="EE0000"/>
-        </w:rPr>
-        <w:t>Coddem</w:t>
+        <w:t>statement</w:t>
       </w:r>
       <w:proofErr w:type="spellEnd"/>
       <w:r>
-        <w:rPr>
-          <w:color w:val="EE0000"/>
-        </w:rPr>
-        <w:t xml:space="preserve"> a stal se základem moderních databázových systémů. V tomto modelu jsou data organizována do tabulek (relací), které obsahují řádky (záznamy) a sloupce (atributy)</w:t>
-      </w:r>
-      <w:r>
-        <w:rPr>
-          <w:color w:val="EE0000"/>
-        </w:rPr>
-        <w:t>.</w:t>
-      </w:r>
-      <w:r>
-        <w:rPr>
-          <w:color w:val="EE0000"/>
-        </w:rPr>
-        <w:t xml:space="preserve"> </w:t>
-      </w:r>
-      <w:r>
-        <w:rPr>
-          <w:color w:val="EE0000"/>
-        </w:rPr>
-        <w:fldChar w:fldCharType="begin"/>
-      </w:r>
-      <w:r>
-        <w:rPr>
-          <w:color w:val="EE0000"/>
-        </w:rPr>
-        <w:instrText xml:space="preserve"> REF _Ref213420097 \r \h </w:instrText>
-      </w:r>
-      <w:r>
-        <w:rPr>
-          <w:color w:val="EE0000"/>
-        </w:rPr>
-      </w:r>
-      <w:r>
-        <w:rPr>
-          <w:color w:val="EE0000"/>
-        </w:rPr>
-        <w:fldChar w:fldCharType="separate"/>
-      </w:r>
-      <w:r>
-        <w:rPr>
-          <w:color w:val="EE0000"/>
-        </w:rPr>
-        <w:t>[6]</w:t>
-      </w:r>
-      <w:r>
-        <w:rPr>
-          <w:color w:val="EE0000"/>
-        </w:rPr>
-        <w:fldChar w:fldCharType="end"/>
-      </w:r>
-      <w:r>
-        <w:rPr>
-          <w:color w:val="EE0000"/>
-        </w:rPr>
-        <w:t xml:space="preserve"> Každá tabulka má primární klíč, jenž jednoznačně identifikuje jednotlivé záznamy.</w:t>
-      </w:r>
-    </w:p>
-    <w:p>
-      <w:pPr>
-        <w:rPr>
-          <w:color w:val="EE0000"/>
-        </w:rPr>
-      </w:pPr>
-      <w:r>
-        <w:rPr>
-          <w:color w:val="EE0000"/>
-        </w:rPr>
-        <w:t xml:space="preserve">Relační model zaručuje konzistenci a integritu dat prostřednictvím relací mezi tabulkami – například vztah </w:t>
-      </w:r>
-      <w:r>
-        <w:rPr>
-          <w:rStyle w:val="Siln"/>
-          <w:b w:val="0"/>
-          <w:bCs w:val="0"/>
-          <w:color w:val="EE0000"/>
-        </w:rPr>
-        <w:t>uživatel</w:t>
-      </w:r>
-      <w:r>
-        <w:rPr>
-          <w:rStyle w:val="Siln"/>
-          <w:color w:val="EE0000"/>
-        </w:rPr>
-        <w:t xml:space="preserve"> – </w:t>
-      </w:r>
-      <w:r>
-        <w:rPr>
-          <w:rStyle w:val="Siln"/>
-          <w:b w:val="0"/>
-          <w:bCs w:val="0"/>
-          <w:color w:val="EE0000"/>
-        </w:rPr>
-        <w:t>uložené</w:t>
-      </w:r>
-      <w:r>
-        <w:rPr>
-          <w:rStyle w:val="Siln"/>
-          <w:color w:val="EE0000"/>
-        </w:rPr>
-        <w:t xml:space="preserve"> heslo</w:t>
-      </w:r>
-      <w:r>
-        <w:rPr>
-          <w:color w:val="EE0000"/>
-        </w:rPr>
-        <w:t xml:space="preserve">. V praxi to znamená, že aplikace pro správu hesel může propojit tabulku </w:t>
+        <w:t>) tvoří posloupnost znaků a klíčových slov SQL, která dodržuje pravidla syntaxe a formátování jazyka. Tento příkaz může ovlivňovat data nebo řídit s</w:t>
+      </w:r>
+      <w:r>
+        <w:t> </w:t>
+      </w:r>
+      <w:r>
+        <w:t xml:space="preserve">nimi související procesy. Lze si ho představit jako "úplnou větu" v SQL, kterou lze úspěšně předat systému pro správu </w:t>
+      </w:r>
+      <w:proofErr w:type="gramStart"/>
+      <w:r>
+        <w:t>databáze.</w:t>
+      </w:r>
+      <w:r>
+        <w:t>[</w:t>
+      </w:r>
+      <w:proofErr w:type="gramEnd"/>
+      <w:r>
+        <w:t>]</w:t>
+      </w:r>
+    </w:p>
+    <w:p>
+      <w:pPr>
+        <w:pStyle w:val="Pokraovn"/>
+      </w:pPr>
+      <w:r>
+        <w:t>Dotaz (</w:t>
       </w:r>
       <w:proofErr w:type="spellStart"/>
       <w:r>
-        <w:rPr>
-          <w:color w:val="EE0000"/>
-        </w:rPr>
-        <w:t>users</w:t>
+        <w:t>query</w:t>
       </w:r>
       <w:proofErr w:type="spellEnd"/>
       <w:r>
-        <w:rPr>
-          <w:color w:val="EE0000"/>
-        </w:rPr>
-        <w:t xml:space="preserve"> s tabulkou </w:t>
-      </w:r>
-      <w:proofErr w:type="spellStart"/>
-      <w:r>
-        <w:rPr>
-          <w:color w:val="EE0000"/>
-        </w:rPr>
-        <w:t>credentials</w:t>
-      </w:r>
-      <w:proofErr w:type="spellEnd"/>
-      <w:r>
-        <w:rPr>
-          <w:color w:val="EE0000"/>
-        </w:rPr>
-        <w:t xml:space="preserve"> pomocí cizího klíče. Tento model umožňuje efektivní dotazování, kontrolu přístupů a minimalizaci redundance</w:t>
-      </w:r>
-      <w:r>
-        <w:rPr>
-          <w:color w:val="EE0000"/>
-        </w:rPr>
-        <w:t>.</w:t>
-      </w:r>
-      <w:r>
-        <w:rPr>
-          <w:color w:val="EE0000"/>
-        </w:rPr>
-        <w:t xml:space="preserve"> </w:t>
-      </w:r>
-      <w:r>
-        <w:rPr>
-          <w:color w:val="EE0000"/>
-        </w:rPr>
-        <w:fldChar w:fldCharType="begin"/>
-      </w:r>
-      <w:r>
-        <w:rPr>
-          <w:color w:val="EE0000"/>
-        </w:rPr>
-        <w:instrText xml:space="preserve"> REF _Ref213420097 \r \h </w:instrText>
-      </w:r>
-      <w:r>
-        <w:rPr>
-          <w:color w:val="EE0000"/>
-        </w:rPr>
-      </w:r>
-      <w:r>
-        <w:rPr>
-          <w:color w:val="EE0000"/>
-        </w:rPr>
-        <w:fldChar w:fldCharType="separate"/>
-      </w:r>
-      <w:r>
-        <w:rPr>
-          <w:color w:val="EE0000"/>
-        </w:rPr>
-        <w:t>[6]</w:t>
-      </w:r>
-      <w:r>
-        <w:rPr>
-          <w:color w:val="EE0000"/>
-        </w:rPr>
-        <w:fldChar w:fldCharType="end"/>
-      </w:r>
-    </w:p>
-    <w:p>
-      <w:pPr>
-        <w:pStyle w:val="Nadpis3"/>
-        <w:rPr>
-          <w:color w:val="EE0000"/>
-        </w:rPr>
-      </w:pPr>
-      <w:bookmarkStart w:id="30" w:name="_Toc216301966"/>
-      <w:r>
-        <w:rPr>
-          <w:color w:val="EE0000"/>
-        </w:rPr>
-        <w:t>SQL příkazy</w:t>
-      </w:r>
-      <w:bookmarkEnd w:id="30"/>
-      <w:r>
-        <w:rPr>
-          <w:color w:val="EE0000"/>
-        </w:rPr>
-        <w:t xml:space="preserve"> </w:t>
-      </w:r>
-    </w:p>
-    <w:p>
-      <w:pPr>
-        <w:pStyle w:val="Pokraovn"/>
-        <w:rPr>
-          <w:color w:val="EE0000"/>
-        </w:rPr>
-      </w:pPr>
-      <w:proofErr w:type="spellStart"/>
-      <w:r>
-        <w:rPr>
-          <w:color w:val="EE0000"/>
-        </w:rPr>
-        <w:t>Structured</w:t>
-      </w:r>
-      <w:proofErr w:type="spellEnd"/>
-      <w:r>
-        <w:rPr>
-          <w:color w:val="EE0000"/>
-        </w:rPr>
-        <w:t xml:space="preserve"> </w:t>
-      </w:r>
-      <w:proofErr w:type="spellStart"/>
-      <w:r>
-        <w:rPr>
-          <w:color w:val="EE0000"/>
-        </w:rPr>
-        <w:t>Query</w:t>
-      </w:r>
-      <w:proofErr w:type="spellEnd"/>
-      <w:r>
-        <w:rPr>
-          <w:color w:val="EE0000"/>
-        </w:rPr>
-        <w:t xml:space="preserve"> </w:t>
-      </w:r>
-      <w:proofErr w:type="spellStart"/>
-      <w:r>
-        <w:rPr>
-          <w:color w:val="EE0000"/>
-        </w:rPr>
-        <w:t>Language</w:t>
-      </w:r>
-      <w:proofErr w:type="spellEnd"/>
-      <w:r>
-        <w:rPr>
-          <w:color w:val="EE0000"/>
-        </w:rPr>
-        <w:t xml:space="preserve"> (SQL) je standardizovaný jazyk používaný pro komunikaci s relačními databázemi. Umožňuje definovat strukturu databáze, vkládat, aktualizovat i mazat data a provádět dotazy. Mezi základní příkazy patří zejména:</w:t>
-      </w:r>
-      <w:r>
-        <w:rPr>
-          <w:color w:val="EE0000"/>
-        </w:rPr>
-        <w:t xml:space="preserve"> </w:t>
-      </w:r>
-      <w:r>
-        <w:rPr>
-          <w:color w:val="EE0000"/>
-        </w:rPr>
-        <w:fldChar w:fldCharType="begin"/>
-      </w:r>
-      <w:r>
-        <w:rPr>
-          <w:color w:val="EE0000"/>
-        </w:rPr>
-        <w:instrText xml:space="preserve"> REF _Ref213420302 \r \h </w:instrText>
-      </w:r>
-      <w:r>
-        <w:rPr>
-          <w:color w:val="EE0000"/>
-        </w:rPr>
-      </w:r>
-      <w:r>
-        <w:rPr>
-          <w:color w:val="EE0000"/>
-        </w:rPr>
-        <w:fldChar w:fldCharType="separate"/>
-      </w:r>
-      <w:r>
-        <w:rPr>
-          <w:color w:val="EE0000"/>
-        </w:rPr>
-        <w:t>[7]</w:t>
-      </w:r>
-      <w:r>
-        <w:rPr>
-          <w:color w:val="EE0000"/>
-        </w:rPr>
-        <w:fldChar w:fldCharType="end"/>
+        <w:t>) je specifický typ příkazu, jehož účelem je získání dat na základě stanovených kritérií. Výsledkem provedení SQL dotazu je sada dat, která splňují podmínky definované v dotazu. K formulaci těchto kritérií se standardně používají klíčová slova SQL.</w:t>
+      </w:r>
+      <w:r>
+        <w:t xml:space="preserve"> Základní SQL dotazy</w:t>
+      </w:r>
+      <w:r>
+        <w:t xml:space="preserve"> [</w:t>
+      </w:r>
+      <w:r>
+        <w:t>https://blog.udemy.com/sql-queries/?utm_campaign=Search_Keyword_Alpha_Prof_la.ES_cc.ROW-Spanish&amp;utm_source=google&amp;utm_medium=paid-search&amp;portfolio=ROW-Spanish&amp;utm_audience=mx&amp;utm_tactic=nb&amp;utm_term=sql%20tutorial&amp;utm_content=g&amp;funnel=&amp;test=&amp;gad_source=1&amp;gad_campaignid=21487757262&amp;gbraid=0AAAAADROdO3KIqJqjuqIGvPu99TpKWixi&amp;gclid=Cj0KCQiAuvTJBhCwARIsAL6</w:t>
+      </w:r>
+      <w:r>
+        <w:lastRenderedPageBreak/>
+        <w:t>Demj7FFx05O88KhKAwEFxi8Nswm6mrNGWiUvd_mXgteVHJ9inNJXAP9oaAqHxEALw_wcB</w:t>
+      </w:r>
+      <w:r>
+        <w:t>]</w:t>
+      </w:r>
+      <w:r>
+        <w:t>:</w:t>
       </w:r>
     </w:p>
     <w:p>
@@ -6999,22 +6841,62 @@
           <w:numId w:val="32"/>
         </w:numPr>
         <w:rPr>
-          <w:color w:val="EE0000"/>
-        </w:rPr>
-      </w:pPr>
-      <w:r>
-        <w:rPr>
           <w:b/>
           <w:bCs/>
-          <w:color w:val="EE0000"/>
-        </w:rPr>
-        <w:t>CREATE</w:t>
-      </w:r>
-      <w:r>
-        <w:rPr>
-          <w:color w:val="EE0000"/>
-        </w:rPr>
-        <w:t xml:space="preserve"> – vytváří tabulky a jiné databázové objekty,</w:t>
+          <w:color w:val="auto"/>
+        </w:rPr>
+      </w:pPr>
+      <w:r>
+        <w:rPr>
+          <w:b/>
+          <w:bCs/>
+          <w:color w:val="auto"/>
+        </w:rPr>
+        <w:t>Vytvoření</w:t>
+      </w:r>
+      <w:r>
+        <w:rPr>
+          <w:b/>
+          <w:bCs/>
+          <w:color w:val="auto"/>
+        </w:rPr>
+        <w:t xml:space="preserve"> </w:t>
+      </w:r>
+      <w:r>
+        <w:rPr>
+          <w:b/>
+          <w:bCs/>
+          <w:color w:val="auto"/>
+        </w:rPr>
+        <w:t>tabulky (CREATE TABLE)</w:t>
+      </w:r>
+      <w:r>
+        <w:rPr>
+          <w:b/>
+          <w:bCs/>
+          <w:color w:val="auto"/>
+        </w:rPr>
+        <w:t xml:space="preserve"> </w:t>
+      </w:r>
+      <w:r>
+        <w:rPr>
+          <w:color w:val="auto"/>
+        </w:rPr>
+        <w:t>-</w:t>
+      </w:r>
+      <w:r>
+        <w:rPr>
+          <w:b/>
+          <w:bCs/>
+          <w:color w:val="auto"/>
+        </w:rPr>
+        <w:t xml:space="preserve"> </w:t>
+      </w:r>
+      <w:r>
+        <w:rPr>
+          <w:color w:val="auto"/>
+        </w:rPr>
+        <w:t>Novou, prázdnou tabulku vytvoříte pomocí klíčového slova CREATE TABLE.</w:t>
       </w:r>
     </w:p>
     <w:p>
@@ -7025,22 +6907,36 @@
           <w:numId w:val="32"/>
         </w:numPr>
         <w:rPr>
-          <w:color w:val="EE0000"/>
+          <w:color w:val="auto"/>
         </w:rPr>
       </w:pPr>
       <w:r>
         <w:rPr>
           <w:b/>
           <w:bCs/>
-          <w:color w:val="EE0000"/>
-        </w:rPr>
-        <w:t>INSERT</w:t>
-      </w:r>
-      <w:r>
-        <w:rPr>
-          <w:color w:val="EE0000"/>
-        </w:rPr>
-        <w:t xml:space="preserve"> – přidává nové záznamy,</w:t>
+          <w:color w:val="auto"/>
+        </w:rPr>
+        <w:t>Vkládání dat (INSERT</w:t>
+      </w:r>
+      <w:r>
+        <w:rPr>
+          <w:b/>
+          <w:bCs/>
+          <w:color w:val="auto"/>
+        </w:rPr>
+        <w:t xml:space="preserve">) </w:t>
+      </w:r>
+      <w:r>
+        <w:rPr>
+          <w:color w:val="auto"/>
+        </w:rPr>
+        <w:t xml:space="preserve">- </w:t>
+      </w:r>
+      <w:r>
+        <w:rPr>
+          <w:color w:val="auto"/>
+        </w:rPr>
+        <w:t>Do tabulky lze přidávat nové záznamy pomocí příkazu INSERT INTO. Dotaz specifikuje cílové sloupce a hodnoty, které se do nich mají uložit.</w:t>
       </w:r>
     </w:p>
     <w:p>
@@ -7051,22 +6947,36 @@
           <w:numId w:val="32"/>
         </w:numPr>
         <w:rPr>
-          <w:color w:val="EE0000"/>
+          <w:color w:val="auto"/>
         </w:rPr>
       </w:pPr>
       <w:r>
         <w:rPr>
           <w:b/>
           <w:bCs/>
-          <w:color w:val="EE0000"/>
-        </w:rPr>
-        <w:t>UPDATE</w:t>
-      </w:r>
-      <w:r>
-        <w:rPr>
-          <w:color w:val="EE0000"/>
-        </w:rPr>
-        <w:t xml:space="preserve"> – upravuje existující data,</w:t>
+          <w:color w:val="auto"/>
+        </w:rPr>
+        <w:t>Čtení dat (SELECT)</w:t>
+      </w:r>
+      <w:r>
+        <w:rPr>
+          <w:b/>
+          <w:bCs/>
+          <w:color w:val="auto"/>
+        </w:rPr>
+        <w:t xml:space="preserve"> </w:t>
+      </w:r>
+      <w:r>
+        <w:rPr>
+          <w:color w:val="auto"/>
+        </w:rPr>
+        <w:t xml:space="preserve">- </w:t>
+      </w:r>
+      <w:r>
+        <w:rPr>
+          <w:color w:val="auto"/>
+        </w:rPr>
+        <w:t>Příkaz SELECT slouží k načtení a zobrazení záznamů z tabulky. Je základním nástrojem pro práci s daty.</w:t>
       </w:r>
     </w:p>
     <w:p>
@@ -7077,22 +6987,36 @@
           <w:numId w:val="32"/>
         </w:numPr>
         <w:rPr>
-          <w:color w:val="EE0000"/>
+          <w:color w:val="auto"/>
         </w:rPr>
       </w:pPr>
       <w:r>
         <w:rPr>
           <w:b/>
           <w:bCs/>
-          <w:color w:val="EE0000"/>
-        </w:rPr>
-        <w:t>DELETE</w:t>
-      </w:r>
-      <w:r>
-        <w:rPr>
-          <w:color w:val="EE0000"/>
-        </w:rPr>
-        <w:t xml:space="preserve"> – odstraňuje záznamy,</w:t>
+          <w:color w:val="auto"/>
+        </w:rPr>
+        <w:t>Řazení výsledků (ORDER BY)</w:t>
+      </w:r>
+      <w:r>
+        <w:rPr>
+          <w:b/>
+          <w:bCs/>
+          <w:color w:val="auto"/>
+        </w:rPr>
+        <w:t xml:space="preserve"> </w:t>
+      </w:r>
+      <w:r>
+        <w:rPr>
+          <w:color w:val="auto"/>
+        </w:rPr>
+        <w:t xml:space="preserve">- </w:t>
+      </w:r>
+      <w:r>
+        <w:rPr>
+          <w:color w:val="auto"/>
+        </w:rPr>
+        <w:t>Pro seřazení zobrazených dat v určitém pořadí se k dotazu SELECT přidává klauzule ORDER BY.</w:t>
       </w:r>
     </w:p>
     <w:p>
@@ -7103,118 +7027,124 @@
           <w:numId w:val="32"/>
         </w:numPr>
         <w:rPr>
-          <w:color w:val="EE0000"/>
+          <w:color w:val="auto"/>
         </w:rPr>
       </w:pPr>
       <w:r>
         <w:rPr>
           <w:b/>
           <w:bCs/>
-          <w:color w:val="EE0000"/>
-        </w:rPr>
-        <w:t>SELECT</w:t>
-      </w:r>
-      <w:r>
-        <w:rPr>
-          <w:color w:val="EE0000"/>
-        </w:rPr>
-        <w:t xml:space="preserve"> – vybírá data z tabulek podle zadaných kritérií.</w:t>
-      </w:r>
-      <w:r>
-        <w:rPr>
-          <w:color w:val="EE0000"/>
-        </w:rPr>
-        <w:br/>
-        <w:t>SQL poskytuje univerzální způsob práce s daty napříč různými databázovými platformami.</w:t>
-      </w:r>
-      <w:r>
-        <w:rPr>
-          <w:color w:val="EE0000"/>
-        </w:rPr>
-        <w:t xml:space="preserve"> </w:t>
-      </w:r>
-    </w:p>
-    <w:p>
-      <w:pPr>
-        <w:rPr>
-          <w:color w:val="EE0000"/>
-        </w:rPr>
-      </w:pPr>
-      <w:r>
-        <w:rPr>
-          <w:color w:val="EE0000"/>
-        </w:rPr>
-        <w:t>SQL také podporuje pokročilé funkce, jako jsou spojování tabulek (JOIN), filtrování dat (WHERE) nebo agregace. Vývojář musí dbát na správné ošetření vstupů uživatelů, aby předešel bezpečnostním hrozbám, jako je SQL</w:t>
+          <w:color w:val="auto"/>
+        </w:rPr>
+        <w:t>Agregace a omezení výstupu (SELECT COUNT)</w:t>
       </w:r>
       <w:r>
         <w:rPr>
           <w:b/>
           <w:bCs/>
-          <w:color w:val="EE0000"/>
+          <w:color w:val="auto"/>
         </w:rPr>
         <w:t xml:space="preserve"> </w:t>
       </w:r>
-      <w:proofErr w:type="spellStart"/>
-      <w:r>
-        <w:rPr>
-          <w:color w:val="EE0000"/>
-        </w:rPr>
-        <w:t>injection</w:t>
-      </w:r>
-      <w:proofErr w:type="spellEnd"/>
-      <w:r>
-        <w:rPr>
-          <w:color w:val="EE0000"/>
-        </w:rPr>
-        <w:t>. Bezpečné zpracování dotazů zajišťují parametrizované příkazy a ORM nástroje, které minimalizují riziko vložení škodlivého kódu</w:t>
-      </w:r>
-      <w:r>
-        <w:rPr>
-          <w:color w:val="EE0000"/>
-        </w:rPr>
-        <w:t>.</w:t>
-      </w:r>
-      <w:r>
-        <w:rPr>
-          <w:color w:val="EE0000"/>
+      <w:r>
+        <w:rPr>
+          <w:color w:val="auto"/>
+        </w:rPr>
+        <w:t xml:space="preserve">- </w:t>
+      </w:r>
+      <w:r>
+        <w:rPr>
+          <w:color w:val="auto"/>
+        </w:rPr>
+        <w:t>Pokud potřebujete zjistit počet záznamů nebo omezit rozsah výsledků (např. při velkém objemu dat), lze použít konstrukce jako SELECT COUNT.</w:t>
+      </w:r>
+    </w:p>
+    <w:p>
+      <w:pPr>
+        <w:pStyle w:val="Odstavecseseznamem"/>
+        <w:numPr>
+          <w:ilvl w:val="0"/>
+          <w:numId w:val="32"/>
+        </w:numPr>
+      </w:pPr>
+      <w:r>
+        <w:rPr>
+          <w:b/>
+          <w:bCs/>
+        </w:rPr>
+        <w:t>Odstranění dat (DELETE)</w:t>
+      </w:r>
+      <w:r>
+        <w:rPr>
+          <w:b/>
+          <w:bCs/>
         </w:rPr>
         <w:t xml:space="preserve"> </w:t>
       </w:r>
       <w:r>
-        <w:rPr>
-          <w:color w:val="EE0000"/>
-        </w:rPr>
-        <w:fldChar w:fldCharType="begin"/>
-      </w:r>
-      <w:r>
-        <w:rPr>
-          <w:color w:val="EE0000"/>
-        </w:rPr>
-        <w:instrText xml:space="preserve"> REF _Ref213420302 \r \h </w:instrText>
-      </w:r>
-      <w:r>
-        <w:rPr>
-          <w:color w:val="EE0000"/>
-        </w:rPr>
-      </w:r>
-      <w:r>
-        <w:rPr>
-          <w:color w:val="EE0000"/>
-        </w:rPr>
-        <w:fldChar w:fldCharType="separate"/>
-      </w:r>
-      <w:r>
-        <w:rPr>
-          <w:color w:val="EE0000"/>
-        </w:rPr>
-        <w:t>[7]</w:t>
-      </w:r>
-      <w:r>
-        <w:rPr>
-          <w:color w:val="EE0000"/>
-        </w:rPr>
-        <w:fldChar w:fldCharType="end"/>
-      </w:r>
+        <w:t xml:space="preserve">- </w:t>
+      </w:r>
+      <w:r>
+        <w:t>Příkaz DELETE umožňuje odstranit vybrané záznamy z tabulky. Podmínky pro výběr řádků k smazání se definují klauzulí WHERE.</w:t>
+      </w:r>
+    </w:p>
+    <w:p>
+      <w:pPr>
+        <w:pStyle w:val="Odstavecseseznamem"/>
+        <w:ind w:firstLine="0"/>
+        <w:rPr>
+          <w:b/>
+          <w:bCs/>
+        </w:rPr>
+      </w:pPr>
+    </w:p>
+    <w:p>
+      <w:pPr>
+        <w:pStyle w:val="Odstavecseseznamem"/>
+        <w:numPr>
+          <w:ilvl w:val="0"/>
+          <w:numId w:val="32"/>
+        </w:numPr>
+        <w:rPr>
+          <w:b/>
+          <w:bCs/>
+        </w:rPr>
+      </w:pPr>
+      <w:r>
+        <w:rPr>
+          <w:b/>
+          <w:bCs/>
+        </w:rPr>
+        <w:t>Aktualizace dat (UPDATE)</w:t>
+      </w:r>
+      <w:r>
+        <w:rPr>
+          <w:b/>
+          <w:bCs/>
+        </w:rPr>
+        <w:t xml:space="preserve"> </w:t>
+      </w:r>
+      <w:r>
+        <w:t xml:space="preserve">- </w:t>
+      </w:r>
+      <w:r>
+        <w:t>Klauzule UPDATE se používá k úpravě existujících záznamů. Umožňuje změnit hodnoty v konkrétních sloupcích u</w:t>
+      </w:r>
+      <w:r>
+        <w:t> </w:t>
+      </w:r>
+      <w:r>
+        <w:t>řádků, které splňují zadanou podmínku.</w:t>
+      </w:r>
+    </w:p>
+    <w:p>
+      <w:pPr>
+        <w:ind w:left="360"/>
+        <w:rPr>
+          <w:b/>
+          <w:bCs/>
+        </w:rPr>
+      </w:pPr>
     </w:p>
     <w:p>
       <w:pPr>
@@ -7260,15 +7190,7 @@
           <w:color w:val="EE0000"/>
           <w:lang w:eastAsia="sk-SK"/>
         </w:rPr>
-        <w:t xml:space="preserve">NET nebo knihovny specifické pro daný </w:t>
-      </w:r>
-      <w:r>
-        <w:rPr>
-          <w:color w:val="EE0000"/>
-          <w:lang w:eastAsia="sk-SK"/>
-        </w:rPr>
-        <w:lastRenderedPageBreak/>
-        <w:t xml:space="preserve">databázový systém, jako například </w:t>
+        <w:t xml:space="preserve">NET nebo knihovny specifické pro daný databázový systém, jako například </w:t>
       </w:r>
       <w:proofErr w:type="spellStart"/>
       <w:r>
@@ -7557,6 +7479,7 @@
       </w:pPr>
       <w:bookmarkStart w:id="32" w:name="_Toc216301968"/>
       <w:r>
+        <w:lastRenderedPageBreak/>
         <w:t>Zabezpečení dat</w:t>
       </w:r>
       <w:bookmarkEnd w:id="32"/>

</xml_diff>

<commit_message>
Psani casti: Pripojeni databaze
</commit_message>
<xml_diff>
--- a/Šablona MPO.docx
+++ b/Šablona MPO.docx
@@ -6149,7 +6149,6 @@
         </w:rPr>
         <w:t xml:space="preserve"> </w:t>
       </w:r>
-      <w:proofErr w:type="gramStart"/>
       <w:r>
         <w:rPr>
           <w:rFonts w:eastAsiaTheme="minorEastAsia"/>
@@ -6165,7 +6164,6 @@
         </w:rPr>
         <w:t>https://learn.microsoft.com/en-us/dotnet/architecture/modern-web-apps-azure/common-web-application-architectures</w:t>
       </w:r>
-      <w:proofErr w:type="gramEnd"/>
       <w:r>
         <w:rPr>
           <w:rFonts w:eastAsiaTheme="minorEastAsia"/>
@@ -6197,16 +6195,11 @@
         <w:t>.NET je moderní open-source platforma pro vývoj softwaru, která je zdarma dostupná a funguje napříč různými operačními systémy. Umožňuje vytvářet širokou škálu aplikací, přičemž podporuje více programovacích jazyků – s jazykem C# jako hlavní volbou.</w:t>
       </w:r>
       <w:r>
-        <w:t xml:space="preserve"> </w:t>
-      </w:r>
-      <w:proofErr w:type="gramStart"/>
-      <w:r>
-        <w:t>[</w:t>
+        <w:t xml:space="preserve"> [</w:t>
       </w:r>
       <w:r>
         <w:t xml:space="preserve"> https://learn.microsoft.com/en-us/dotnet/core/introduction</w:t>
       </w:r>
-      <w:proofErr w:type="gramEnd"/>
       <w:r>
         <w:t>]</w:t>
       </w:r>
@@ -6349,7 +6342,6 @@
       <w:r>
         <w:t xml:space="preserve"> </w:t>
       </w:r>
-      <w:proofErr w:type="gramStart"/>
       <w:r>
         <w:t>W</w:t>
       </w:r>
@@ -6357,7 +6349,6 @@
         <w:t>eb</w:t>
       </w:r>
       <w:bookmarkEnd w:id="25"/>
-      <w:proofErr w:type="gramEnd"/>
       <w:r>
         <w:t xml:space="preserve"> </w:t>
       </w:r>
@@ -6419,16 +6410,11 @@
         <w:t>možnosti.</w:t>
       </w:r>
       <w:r>
-        <w:t xml:space="preserve"> </w:t>
-      </w:r>
-      <w:proofErr w:type="gramStart"/>
-      <w:r>
-        <w:t>[</w:t>
+        <w:t xml:space="preserve"> [</w:t>
       </w:r>
       <w:r>
         <w:t xml:space="preserve"> https://medium.com/theymakedesign/web-app-vs-desktop-app-3841e8cb3996</w:t>
       </w:r>
-      <w:proofErr w:type="gramEnd"/>
       <w:r>
         <w:t>]</w:t>
       </w:r>
@@ -6559,24 +6545,11 @@
         <w:t> </w:t>
       </w:r>
       <w:r>
-        <w:t xml:space="preserve">úvahu její technické znalosti a zkušenosti. Rozhraní by mělo prezentovat funkce jednoznačně a jednoduše, umožňovat okamžitou orientaci a navozovat u uživatele pocit jistoty a bezpečí. Nedílnou součástí je i estetická </w:t>
-      </w:r>
-      <w:proofErr w:type="gramStart"/>
-      <w:r>
-        <w:t>působivost</w:t>
-      </w:r>
-      <w:proofErr w:type="gramEnd"/>
-      <w:r>
-        <w:t xml:space="preserve"> a především neustálé ověřování celé koncepce prostřednictvím testování s reálnými </w:t>
-      </w:r>
-      <w:proofErr w:type="gramStart"/>
-      <w:r>
-        <w:t>uživateli.</w:t>
+        <w:t>úvahu její technické znalosti a zkušenosti. Rozhraní by mělo prezentovat funkce jednoznačně a jednoduše, umožňovat okamžitou orientaci a navozovat u uživatele pocit jistoty a bezpečí. Nedílnou součástí je i estetická působivost a především neustálé ověřování celé koncepce prostřednictvím testování s reálnými uživateli.</w:t>
       </w:r>
       <w:r>
         <w:t>[</w:t>
       </w:r>
-      <w:proofErr w:type="gramEnd"/>
       <w:r>
         <w:t xml:space="preserve"> https://www.grappa.sk/blog/co-je-to-ux-a-ui-a-aky-je-medzi-nimi-rozdiel/</w:t>
       </w:r>
@@ -6776,18 +6749,10 @@
         <w:t> </w:t>
       </w:r>
       <w:r>
-        <w:t xml:space="preserve">nimi související procesy. Lze si ho představit jako "úplnou větu" v SQL, kterou lze úspěšně předat systému pro správu </w:t>
-      </w:r>
-      <w:proofErr w:type="gramStart"/>
-      <w:r>
-        <w:t>databáze.</w:t>
-      </w:r>
-      <w:r>
-        <w:t>[</w:t>
-      </w:r>
-      <w:proofErr w:type="gramEnd"/>
-      <w:r>
-        <w:t>]</w:t>
+        <w:t>nimi související procesy. Lze si ho představit jako "úplnou větu" v SQL, kterou lze úspěšně předat systému pro správu databáze.</w:t>
+      </w:r>
+      <w:r>
+        <w:t>[]</w:t>
       </w:r>
     </w:p>
     <w:p>
@@ -7142,17 +7107,177 @@
       <w:pPr>
         <w:pStyle w:val="Nadpis3"/>
         <w:rPr>
-          <w:color w:val="EE0000"/>
+          <w:color w:val="auto"/>
         </w:rPr>
       </w:pPr>
       <w:bookmarkStart w:id="31" w:name="_Toc216301967"/>
       <w:r>
         <w:rPr>
-          <w:color w:val="EE0000"/>
+          <w:color w:val="auto"/>
         </w:rPr>
         <w:t>Připojení databáze</w:t>
       </w:r>
       <w:bookmarkEnd w:id="31"/>
+    </w:p>
+    <w:p>
+      <w:pPr>
+        <w:rPr>
+          <w:color w:val="auto"/>
+          <w:lang w:eastAsia="sk-SK"/>
+        </w:rPr>
+      </w:pPr>
+      <w:r>
+        <w:rPr>
+          <w:color w:val="auto"/>
+          <w:lang w:eastAsia="sk-SK"/>
+        </w:rPr>
+        <w:t>a</w:t>
+      </w:r>
+      <w:r>
+        <w:rPr>
+          <w:rFonts w:ascii="Segoe UI" w:hAnsi="Segoe UI" w:cs="Segoe UI"/>
+          <w:color w:val="auto"/>
+          <w:szCs w:val="24"/>
+          <w:lang w:eastAsia="sk-SK"/>
+        </w:rPr>
+        <w:t xml:space="preserve"> </w:t>
+      </w:r>
+      <w:r>
+        <w:rPr>
+          <w:color w:val="auto"/>
+          <w:lang w:eastAsia="sk-SK"/>
+        </w:rPr>
+        <w:t>V prostředí .NET Framework je pro práci se SQL Server k dispozici datový poskytovatel, který využívá formát připojovacího řetězce podobný standardu OLE DB (ADO). Konkrétní povolené parametry a jejich hodnoty pro toto spojení jsou definovány ve vlastnosti </w:t>
+      </w:r>
+      <w:proofErr w:type="spellStart"/>
+      <w:r>
+        <w:rPr>
+          <w:color w:val="auto"/>
+          <w:lang w:eastAsia="sk-SK"/>
+        </w:rPr>
+        <w:t>ConnectionString</w:t>
+      </w:r>
+      <w:proofErr w:type="spellEnd"/>
+      <w:r>
+        <w:rPr>
+          <w:color w:val="auto"/>
+          <w:lang w:eastAsia="sk-SK"/>
+        </w:rPr>
+        <w:t> třídy </w:t>
+      </w:r>
+      <w:proofErr w:type="spellStart"/>
+      <w:r>
+        <w:rPr>
+          <w:color w:val="auto"/>
+          <w:lang w:eastAsia="sk-SK"/>
+        </w:rPr>
+        <w:t>SqlConnection</w:t>
+      </w:r>
+      <w:proofErr w:type="spellEnd"/>
+      <w:r>
+        <w:rPr>
+          <w:color w:val="auto"/>
+          <w:lang w:eastAsia="sk-SK"/>
+        </w:rPr>
+        <w:t>. Pro dynamické sestavování správně formátovaných připojovacích řetězců během běhu programu lze využít třídu </w:t>
+      </w:r>
+      <w:proofErr w:type="spellStart"/>
+      <w:r>
+        <w:rPr>
+          <w:color w:val="auto"/>
+          <w:lang w:eastAsia="sk-SK"/>
+        </w:rPr>
+        <w:t>SqlConnectionStringBuilder</w:t>
+      </w:r>
+      <w:proofErr w:type="spellEnd"/>
+      <w:r>
+        <w:rPr>
+          <w:color w:val="auto"/>
+          <w:lang w:eastAsia="sk-SK"/>
+        </w:rPr>
+        <w:t>.</w:t>
+      </w:r>
+      <w:r>
+        <w:rPr>
+          <w:color w:val="auto"/>
+          <w:lang w:eastAsia="sk-SK"/>
+        </w:rPr>
+        <w:t xml:space="preserve"> </w:t>
+      </w:r>
+    </w:p>
+    <w:p>
+      <w:pPr>
+        <w:rPr>
+          <w:color w:val="auto"/>
+          <w:lang w:eastAsia="sk-SK"/>
+        </w:rPr>
+      </w:pPr>
+      <w:r>
+        <w:rPr>
+          <w:color w:val="auto"/>
+          <w:lang w:eastAsia="sk-SK"/>
+        </w:rPr>
+        <w:t>[</w:t>
+      </w:r>
+      <w:r>
+        <w:rPr>
+          <w:color w:val="auto"/>
+          <w:lang w:eastAsia="sk-SK"/>
+        </w:rPr>
+        <w:t>https://learn.microsoft.com/en-us/dotnet/framework/data/adonet/establishing-the-connection</w:t>
+      </w:r>
+      <w:r>
+        <w:rPr>
+          <w:color w:val="auto"/>
+          <w:lang w:eastAsia="sk-SK"/>
+        </w:rPr>
+        <w:t>]</w:t>
+      </w:r>
+    </w:p>
+    <w:p>
+      <w:pPr>
+        <w:rPr>
+          <w:color w:val="auto"/>
+          <w:lang w:eastAsia="sk-SK"/>
+        </w:rPr>
+      </w:pPr>
+      <w:r>
+        <w:rPr>
+          <w:color w:val="auto"/>
+          <w:lang w:eastAsia="sk-SK"/>
+        </w:rPr>
+        <w:lastRenderedPageBreak/>
+        <w:t>Pro ověřování spojení se doporučuje používat integrované zabezpečení SQL Serveru, někdy označované jako důvěryhodné připojení. Tato metoda zvyšuje bezpečnost, protože se v připojovacím řetězci nepřenáší uživatelské jméno a heslo. Místo toho využívá bezpečnostní identitu (token) aktuálně spuštěného procesu. V případě desktopových aplikací je touto identitou obvykle právě přihlášený uživatel systému.</w:t>
+      </w:r>
+    </w:p>
+    <w:p>
+      <w:pPr>
+        <w:rPr>
+          <w:color w:val="auto"/>
+          <w:lang w:eastAsia="sk-SK"/>
+        </w:rPr>
+      </w:pPr>
+      <w:r>
+        <w:rPr>
+          <w:color w:val="auto"/>
+          <w:lang w:eastAsia="sk-SK"/>
+        </w:rPr>
+        <w:t>[</w:t>
+      </w:r>
+      <w:r>
+        <w:rPr>
+          <w:color w:val="auto"/>
+          <w:lang w:eastAsia="sk-SK"/>
+        </w:rPr>
+        <w:t>https://learn.microsoft.com/en-us/dotnet/framework/data/adonet/establishing-the-connection</w:t>
+      </w:r>
+      <w:r>
+        <w:rPr>
+          <w:color w:val="auto"/>
+          <w:lang w:eastAsia="sk-SK"/>
+        </w:rPr>
+        <w:t>]</w:t>
+      </w:r>
     </w:p>
     <w:p>
       <w:pPr>
@@ -7161,309 +7286,6 @@
           <w:lang w:eastAsia="sk-SK"/>
         </w:rPr>
       </w:pPr>
-      <w:r>
-        <w:rPr>
-          <w:color w:val="EE0000"/>
-          <w:lang w:eastAsia="sk-SK"/>
-        </w:rPr>
-        <w:t>Propojení aplikace s databází je klíčové pro ukládání a načítání informací. V prostředí .NET se k tomu využívá rozhraní ADO</w:t>
-      </w:r>
-      <w:r>
-        <w:rPr>
-          <w:b/>
-          <w:bCs/>
-          <w:color w:val="EE0000"/>
-          <w:lang w:eastAsia="sk-SK"/>
-        </w:rPr>
-        <w:t>.</w:t>
-      </w:r>
-      <w:r>
-        <w:rPr>
-          <w:color w:val="EE0000"/>
-          <w:lang w:eastAsia="sk-SK"/>
-        </w:rPr>
-        <w:t xml:space="preserve">NET nebo knihovny specifické pro daný databázový systém, jako například </w:t>
-      </w:r>
-      <w:proofErr w:type="spellStart"/>
-      <w:r>
-        <w:rPr>
-          <w:color w:val="EE0000"/>
-          <w:lang w:eastAsia="sk-SK"/>
-        </w:rPr>
-        <w:t>MySQL</w:t>
-      </w:r>
-      <w:proofErr w:type="spellEnd"/>
-      <w:r>
-        <w:rPr>
-          <w:b/>
-          <w:bCs/>
-          <w:color w:val="EE0000"/>
-          <w:lang w:eastAsia="sk-SK"/>
-        </w:rPr>
-        <w:t xml:space="preserve"> </w:t>
-      </w:r>
-      <w:proofErr w:type="spellStart"/>
-      <w:r>
-        <w:rPr>
-          <w:color w:val="EE0000"/>
-          <w:lang w:eastAsia="sk-SK"/>
-        </w:rPr>
-        <w:t>Connector</w:t>
-      </w:r>
-      <w:proofErr w:type="spellEnd"/>
-      <w:r>
-        <w:rPr>
-          <w:b/>
-          <w:bCs/>
-          <w:color w:val="EE0000"/>
-          <w:lang w:eastAsia="sk-SK"/>
-        </w:rPr>
-        <w:t>/</w:t>
-      </w:r>
-      <w:r>
-        <w:rPr>
-          <w:color w:val="EE0000"/>
-          <w:lang w:eastAsia="sk-SK"/>
-        </w:rPr>
-        <w:t>NET</w:t>
-      </w:r>
-      <w:r>
-        <w:rPr>
-          <w:color w:val="EE0000"/>
-          <w:lang w:eastAsia="sk-SK"/>
-        </w:rPr>
-        <w:t xml:space="preserve"> </w:t>
-      </w:r>
-      <w:r>
-        <w:rPr>
-          <w:color w:val="EE0000"/>
-          <w:lang w:eastAsia="sk-SK"/>
-        </w:rPr>
-        <w:fldChar w:fldCharType="begin"/>
-      </w:r>
-      <w:r>
-        <w:rPr>
-          <w:color w:val="EE0000"/>
-          <w:lang w:eastAsia="sk-SK"/>
-        </w:rPr>
-        <w:instrText xml:space="preserve"> REF _Ref213419691 \r \h </w:instrText>
-      </w:r>
-      <w:r>
-        <w:rPr>
-          <w:color w:val="EE0000"/>
-          <w:lang w:eastAsia="sk-SK"/>
-        </w:rPr>
-      </w:r>
-      <w:r>
-        <w:rPr>
-          <w:color w:val="EE0000"/>
-          <w:lang w:eastAsia="sk-SK"/>
-        </w:rPr>
-        <w:fldChar w:fldCharType="separate"/>
-      </w:r>
-      <w:r>
-        <w:rPr>
-          <w:color w:val="EE0000"/>
-          <w:lang w:eastAsia="sk-SK"/>
-        </w:rPr>
-        <w:t>[3]</w:t>
-      </w:r>
-      <w:r>
-        <w:rPr>
-          <w:color w:val="EE0000"/>
-          <w:lang w:eastAsia="sk-SK"/>
-        </w:rPr>
-        <w:fldChar w:fldCharType="end"/>
-      </w:r>
-      <w:r>
-        <w:rPr>
-          <w:color w:val="EE0000"/>
-          <w:lang w:eastAsia="sk-SK"/>
-        </w:rPr>
-        <w:t>,</w:t>
-      </w:r>
-      <w:r>
-        <w:rPr>
-          <w:color w:val="EE0000"/>
-          <w:lang w:eastAsia="sk-SK"/>
-        </w:rPr>
-        <w:t xml:space="preserve"> </w:t>
-      </w:r>
-      <w:r>
-        <w:rPr>
-          <w:color w:val="EE0000"/>
-          <w:lang w:eastAsia="sk-SK"/>
-        </w:rPr>
-        <w:fldChar w:fldCharType="begin"/>
-      </w:r>
-      <w:r>
-        <w:rPr>
-          <w:color w:val="EE0000"/>
-          <w:lang w:eastAsia="sk-SK"/>
-        </w:rPr>
-        <w:instrText xml:space="preserve"> REF _Ref213420320 \r \h </w:instrText>
-      </w:r>
-      <w:r>
-        <w:rPr>
-          <w:color w:val="EE0000"/>
-          <w:lang w:eastAsia="sk-SK"/>
-        </w:rPr>
-      </w:r>
-      <w:r>
-        <w:rPr>
-          <w:color w:val="EE0000"/>
-          <w:lang w:eastAsia="sk-SK"/>
-        </w:rPr>
-        <w:fldChar w:fldCharType="separate"/>
-      </w:r>
-      <w:r>
-        <w:rPr>
-          <w:color w:val="EE0000"/>
-          <w:lang w:eastAsia="sk-SK"/>
-        </w:rPr>
-        <w:t>[8]</w:t>
-      </w:r>
-      <w:r>
-        <w:rPr>
-          <w:color w:val="EE0000"/>
-          <w:lang w:eastAsia="sk-SK"/>
-        </w:rPr>
-        <w:fldChar w:fldCharType="end"/>
-      </w:r>
-      <w:r>
-        <w:rPr>
-          <w:color w:val="EE0000"/>
-          <w:lang w:eastAsia="sk-SK"/>
-        </w:rPr>
-        <w:t xml:space="preserve">. Tento nástroj umožňuje aplikaci v jazyce C# komunikovat s databází </w:t>
-      </w:r>
-      <w:proofErr w:type="spellStart"/>
-      <w:r>
-        <w:rPr>
-          <w:color w:val="EE0000"/>
-          <w:lang w:eastAsia="sk-SK"/>
-        </w:rPr>
-        <w:t>MySQL</w:t>
-      </w:r>
-      <w:proofErr w:type="spellEnd"/>
-      <w:r>
-        <w:rPr>
-          <w:color w:val="EE0000"/>
-          <w:lang w:eastAsia="sk-SK"/>
-        </w:rPr>
-        <w:t xml:space="preserve"> prostřednictvím tříd jako </w:t>
-      </w:r>
-      <w:proofErr w:type="spellStart"/>
-      <w:r>
-        <w:rPr>
-          <w:color w:val="EE0000"/>
-          <w:lang w:eastAsia="sk-SK"/>
-        </w:rPr>
-        <w:t>MySqlConnection</w:t>
-      </w:r>
-      <w:proofErr w:type="spellEnd"/>
-      <w:r>
-        <w:rPr>
-          <w:color w:val="EE0000"/>
-          <w:lang w:eastAsia="sk-SK"/>
-        </w:rPr>
-        <w:t xml:space="preserve">, </w:t>
-      </w:r>
-      <w:proofErr w:type="spellStart"/>
-      <w:r>
-        <w:rPr>
-          <w:color w:val="EE0000"/>
-          <w:lang w:eastAsia="sk-SK"/>
-        </w:rPr>
-        <w:t>MySqlCommand</w:t>
-      </w:r>
-      <w:proofErr w:type="spellEnd"/>
-      <w:r>
-        <w:rPr>
-          <w:color w:val="EE0000"/>
-          <w:lang w:eastAsia="sk-SK"/>
-        </w:rPr>
-        <w:t xml:space="preserve"> a </w:t>
-      </w:r>
-      <w:proofErr w:type="spellStart"/>
-      <w:r>
-        <w:rPr>
-          <w:color w:val="EE0000"/>
-          <w:lang w:eastAsia="sk-SK"/>
-        </w:rPr>
-        <w:t>MySqlDataReader</w:t>
-      </w:r>
-      <w:proofErr w:type="spellEnd"/>
-      <w:r>
-        <w:rPr>
-          <w:color w:val="EE0000"/>
-          <w:lang w:eastAsia="sk-SK"/>
-        </w:rPr>
-        <w:t>.</w:t>
-      </w:r>
-    </w:p>
-    <w:p>
-      <w:pPr>
-        <w:rPr>
-          <w:color w:val="EE0000"/>
-          <w:lang w:eastAsia="sk-SK"/>
-        </w:rPr>
-      </w:pPr>
-      <w:r>
-        <w:rPr>
-          <w:color w:val="EE0000"/>
-          <w:lang w:eastAsia="sk-SK"/>
-        </w:rPr>
-        <w:t>Tyto třídy zprostředkovávají bezpečnou komunikaci mezi aplikací a databází, umožňují provádět dotazy, číst výsledky a pracovat s přenesenými daty.</w:t>
-      </w:r>
-      <w:r>
-        <w:rPr>
-          <w:color w:val="EE0000"/>
-          <w:lang w:eastAsia="sk-SK"/>
-        </w:rPr>
-        <w:t xml:space="preserve"> </w:t>
-      </w:r>
-      <w:r>
-        <w:rPr>
-          <w:color w:val="EE0000"/>
-          <w:lang w:eastAsia="sk-SK"/>
-        </w:rPr>
-        <w:fldChar w:fldCharType="begin"/>
-      </w:r>
-      <w:r>
-        <w:rPr>
-          <w:color w:val="EE0000"/>
-          <w:lang w:eastAsia="sk-SK"/>
-        </w:rPr>
-        <w:instrText xml:space="preserve"> REF _Ref213420320 \r \h </w:instrText>
-      </w:r>
-      <w:r>
-        <w:rPr>
-          <w:color w:val="EE0000"/>
-          <w:lang w:eastAsia="sk-SK"/>
-        </w:rPr>
-      </w:r>
-      <w:r>
-        <w:rPr>
-          <w:color w:val="EE0000"/>
-          <w:lang w:eastAsia="sk-SK"/>
-        </w:rPr>
-        <w:fldChar w:fldCharType="separate"/>
-      </w:r>
-      <w:r>
-        <w:rPr>
-          <w:color w:val="EE0000"/>
-          <w:lang w:eastAsia="sk-SK"/>
-        </w:rPr>
-        <w:t>[8]</w:t>
-      </w:r>
-      <w:r>
-        <w:rPr>
-          <w:color w:val="EE0000"/>
-          <w:lang w:eastAsia="sk-SK"/>
-        </w:rPr>
-        <w:fldChar w:fldCharType="end"/>
-      </w:r>
     </w:p>
     <w:p>
       <w:pPr>
@@ -7471,7 +7293,6 @@
       </w:pPr>
       <w:bookmarkStart w:id="32" w:name="_Toc216301968"/>
       <w:r>
-        <w:lastRenderedPageBreak/>
         <w:t>Zabezpečení dat</w:t>
       </w:r>
       <w:bookmarkEnd w:id="32"/>

</xml_diff>